<commit_message>
Doppel U ist raus
</commit_message>
<xml_diff>
--- a/Bugs.docx
+++ b/Bugs.docx
@@ -19,66 +19,25 @@
     </w:p>
     <w:p>
       <w:r>
-        <w:t>Reihen: Anzahl der Reihen und Anzahl der Tische pro Reihe angeben.</w:t>
-      </w:r>
-    </w:p>
-    <w:p>
-      <w:r>
-        <w:t xml:space="preserve">U-Form: U </w:t>
-      </w:r>
-      <w:r>
-        <w:t>L</w:t>
-      </w:r>
-      <w:r>
-        <w:t xml:space="preserve">änge angeben, auch unterschiedliche U </w:t>
-      </w:r>
-      <w:r>
-        <w:t>L</w:t>
-      </w:r>
-      <w:r>
-        <w:t>änge,</w:t>
-      </w:r>
-      <w:r>
-        <w:t xml:space="preserve"> Breite angeben,</w:t>
-      </w:r>
-      <w:r>
-        <w:t xml:space="preserve"> Anzahl der Tische in der Mitte, Drag and Drop? Für </w:t>
-      </w:r>
-      <w:r>
-        <w:t>individuelle</w:t>
+        <w:t>PDF: Immer an A4 Größe denken und auch Platz ausnutzen. Gruppen Tische zum Beispiel sind in 2 Reihen angeordnet.</w:t>
+      </w:r>
+      <w:r>
+        <w:t xml:space="preserve"> Auch der Wechsel zwischen</w:t>
       </w:r>
       <w:r>
         <w:t xml:space="preserve"> </w:t>
       </w:r>
       <w:r>
-        <w:t>A</w:t>
-      </w:r>
-      <w:r>
-        <w:t>nordnung der Tische?</w:t>
-      </w:r>
-      <w:r>
-        <w:t xml:space="preserve"> Anzahl der Tische oder endlos Clone die an Raster angeheftet werden.</w:t>
-      </w:r>
-    </w:p>
-    <w:p>
-      <w:r>
-        <w:t xml:space="preserve">Tische müssen im Sitzplan gedreht werden können. </w:t>
-      </w:r>
-    </w:p>
-    <w:p/>
-    <w:p>
-      <w:proofErr w:type="spellStart"/>
-      <w:r>
-        <w:t>GruppenTische</w:t>
-      </w:r>
-      <w:proofErr w:type="spellEnd"/>
-      <w:r>
-        <w:t xml:space="preserve">: Anzahl der Gruppen angeben oder Anzahl der Gruppenmitglieder. </w:t>
-      </w:r>
-    </w:p>
-    <w:p>
-      <w:r>
-        <w:t>PDF: Immer an A4 Größe denken und auch Platz ausnutzen. Gruppen Tische zum Beispiel sind in 2 Reihen angeordnet.</w:t>
+        <w:t>Hoch</w:t>
+      </w:r>
+      <w:r>
+        <w:t>-</w:t>
+      </w:r>
+      <w:r>
+        <w:t xml:space="preserve"> und Querformat sollte, abhängig vom Sitzplan anpassbar sein.</w:t>
+      </w:r>
+      <w:r>
+        <w:t xml:space="preserve"> Meinetwegen auch abhängig vom Sitzplatz. Es muss eine Lehrer- sich und eine Schülersicht geben.</w:t>
       </w:r>
     </w:p>
     <w:p>

</xml_diff>

<commit_message>
auf 10 Gruppen begrenzt
</commit_message>
<xml_diff>
--- a/Bugs.docx
+++ b/Bugs.docx
@@ -2,16 +2,6 @@
 <file path=word/document.xml><?xml version="1.0" encoding="utf-8"?>
 <w:document xmlns:wpc="http://schemas.microsoft.com/office/word/2010/wordprocessingCanvas" xmlns:cx="http://schemas.microsoft.com/office/drawing/2014/chartex" xmlns:cx1="http://schemas.microsoft.com/office/drawing/2015/9/8/chartex" xmlns:cx2="http://schemas.microsoft.com/office/drawing/2015/10/21/chartex" xmlns:cx3="http://schemas.microsoft.com/office/drawing/2016/5/9/chartex" xmlns:cx4="http://schemas.microsoft.com/office/drawing/2016/5/10/chartex" xmlns:cx5="http://schemas.microsoft.com/office/drawing/2016/5/11/chartex" xmlns:cx6="http://schemas.microsoft.com/office/drawing/2016/5/12/chartex" xmlns:cx7="http://schemas.microsoft.com/office/drawing/2016/5/13/chartex" xmlns:cx8="http://schemas.microsoft.com/office/drawing/2016/5/14/chartex" xmlns:mc="http://schemas.openxmlformats.org/markup-compatibility/2006" xmlns:aink="http://schemas.microsoft.com/office/drawing/2016/ink" xmlns:am3d="http://schemas.microsoft.com/office/drawing/2017/model3d" xmlns:o="urn:schemas-microsoft-com:office:office" xmlns:oel="http://schemas.microsoft.com/office/2019/extlst" xmlns:r="http://schemas.openxmlformats.org/officeDocument/2006/relationships" xmlns:m="http://schemas.openxmlformats.org/officeDocument/2006/math" xmlns:v="urn:schemas-microsoft-com:vml" xmlns:wp14="http://schemas.microsoft.com/office/word/2010/wordprocessingDrawing" xmlns:wp="http://schemas.openxmlformats.org/drawingml/2006/wordprocessingDrawing" xmlns:w10="urn:schemas-microsoft-com:office:word" xmlns:w="http://schemas.openxmlformats.org/wordprocessingml/2006/main" xmlns:w14="http://schemas.microsoft.com/office/word/2010/wordml" xmlns:w15="http://schemas.microsoft.com/office/word/2012/wordml" xmlns:w16cex="http://schemas.microsoft.com/office/word/2018/wordml/cex" xmlns:w16cid="http://schemas.microsoft.com/office/word/2016/wordml/cid" xmlns:w16="http://schemas.microsoft.com/office/word/2018/wordml" xmlns:w16sdtdh="http://schemas.microsoft.com/office/word/2020/wordml/sdtdatahash" xmlns:w16se="http://schemas.microsoft.com/office/word/2015/wordml/symex" xmlns:wpg="http://schemas.microsoft.com/office/word/2010/wordprocessingGroup" xmlns:wpi="http://schemas.microsoft.com/office/word/2010/wordprocessingInk" xmlns:wne="http://schemas.microsoft.com/office/word/2006/wordml" xmlns:wps="http://schemas.microsoft.com/office/word/2010/wordprocessingShape" mc:Ignorable="w14 w15 w16se w16cid w16 w16cex w16sdtdh wp14">
   <w:body>
-    <w:p>
-      <w:r>
-        <w:t xml:space="preserve">Klasse zum Teilen vorschlagen: Code in anderem Fenster anzeigen, so dass man ihn auch kopieren kann. </w:t>
-      </w:r>
-    </w:p>
-    <w:p>
-      <w:r>
-        <w:t>Verwaltung der Gruppen. Beschränkung der Gruppen auf maximal 10</w:t>
-      </w:r>
-    </w:p>
     <w:p>
       <w:r>
         <w:t>Sitzplan:</w:t>

</xml_diff>